<commit_message>
Corrige redundância de glossario e corrije arquivo da sprint 1
</commit_message>
<xml_diff>
--- a/documentation/Glossario.docx
+++ b/documentation/Glossario.docx
@@ -1097,6 +1097,13 @@
           <w:highlight w:val="none"/>
         </w:rPr>
       </w:r>
+      <w:r>
+        <w:rPr>
+          <w:b w:val="0"/>
+          <w:bCs w:val="0"/>
+          <w:highlight w:val="none"/>
+        </w:rPr>
+      </w:r>
     </w:p>
     <w:p>
       <w:pPr>
@@ -1118,7 +1125,6 @@
           <w:b/>
           <w:bCs/>
           <w:highlight w:val="none"/>
-          <w:lang w:val="undefined"/>
         </w:rPr>
         <w:t xml:space="preserve">GPT</w:t>
       </w:r>
@@ -1153,6 +1159,13 @@
           <w:highlight w:val="none"/>
         </w:rPr>
       </w:r>
+      <w:r>
+        <w:rPr>
+          <w:b w:val="0"/>
+          <w:bCs w:val="0"/>
+          <w:highlight w:val="none"/>
+        </w:rPr>
+      </w:r>
     </w:p>
     <w:p>
       <w:pPr>
@@ -1181,7 +1194,6 @@
           <w:b/>
           <w:bCs/>
           <w:highlight w:val="none"/>
-          <w:lang w:val="undefined"/>
         </w:rPr>
         <w:t xml:space="preserve">Auto supervisionado</w:t>
       </w:r>
@@ -1218,13 +1230,6 @@
           <w:highlight w:val="none"/>
         </w:rPr>
       </w:r>
-      <w:r>
-        <w:rPr>
-          <w:b w:val="0"/>
-          <w:bCs w:val="0"/>
-          <w:highlight w:val="none"/>
-        </w:rPr>
-      </w:r>
     </w:p>
     <w:p>
       <w:pPr>
@@ -1253,7 +1258,6 @@
           <w:b/>
           <w:bCs/>
           <w:highlight w:val="none"/>
-          <w:lang w:val="undefined"/>
         </w:rPr>
         <w:t xml:space="preserve">Standards</w:t>
       </w:r>
@@ -1333,6 +1337,13 @@
           <w:highlight w:val="none"/>
         </w:rPr>
       </w:r>
+      <w:r>
+        <w:rPr>
+          <w:b w:val="0"/>
+          <w:bCs w:val="0"/>
+          <w:highlight w:val="none"/>
+        </w:rPr>
+      </w:r>
     </w:p>
     <w:p>
       <w:pPr>
@@ -1378,6 +1389,13 @@
           <w:highlight w:val="none"/>
         </w:rPr>
       </w:r>
+      <w:r>
+        <w:rPr>
+          <w:b w:val="0"/>
+          <w:bCs w:val="0"/>
+          <w:highlight w:val="none"/>
+        </w:rPr>
+      </w:r>
     </w:p>
     <w:p>
       <w:pPr>
@@ -1415,7 +1433,6 @@
         <w:rPr>
           <w:b w:val="0"/>
           <w:bCs w:val="0"/>
-          <w:lang w:val="undefined"/>
         </w:rPr>
         <w:t xml:space="preserve">Sistemas </w:t>
       </w:r>
@@ -1423,7 +1440,6 @@
         <w:rPr>
           <w:b w:val="0"/>
           <w:bCs w:val="0"/>
-          <w:lang w:val="undefined"/>
         </w:rPr>
         <w:t xml:space="preserve">NLP</w:t>
       </w:r>
@@ -1431,7 +1447,6 @@
         <w:rPr>
           <w:b w:val="0"/>
           <w:bCs w:val="0"/>
-          <w:lang w:val="undefined"/>
         </w:rPr>
         <w:t xml:space="preserve"> (</w:t>
       </w:r>
@@ -1439,7 +1454,6 @@
         <w:rPr>
           <w:b w:val="0"/>
           <w:bCs w:val="0"/>
-          <w:lang w:val="undefined"/>
         </w:rPr>
         <w:t xml:space="preserve">Natural Language Processing</w:t>
       </w:r>
@@ -1447,7 +1461,6 @@
         <w:rPr>
           <w:b w:val="0"/>
           <w:bCs w:val="0"/>
-          <w:lang w:val="undefined"/>
         </w:rPr>
         <w:t xml:space="preserve">, ou </w:t>
       </w:r>
@@ -1455,7 +1468,6 @@
         <w:rPr>
           <w:b w:val="0"/>
           <w:bCs w:val="0"/>
-          <w:lang w:val="undefined"/>
         </w:rPr>
         <w:t xml:space="preserve">Processamento de Linguagem Natural</w:t>
       </w:r>
@@ -1463,7 +1475,6 @@
         <w:rPr>
           <w:b w:val="0"/>
           <w:bCs w:val="0"/>
-          <w:lang w:val="undefined"/>
         </w:rPr>
         <w:t xml:space="preserve">) são </w:t>
       </w:r>
@@ -1471,37 +1482,9 @@
         <w:rPr>
           <w:b w:val="0"/>
           <w:bCs w:val="0"/>
-          <w:lang w:val="undefined"/>
         </w:rPr>
         <w:t xml:space="preserve">ferramentas de inteligência artificial que ajudam os computadores a ler, ouvir, entender e criar a linguagem dos seres humanos</w:t>
       </w:r>
-      <w:r>
-        <w:rPr>
-          <w:b w:val="0"/>
-          <w:bCs w:val="0"/>
-          <w:lang w:val="undefined" w:bidi="undefined"/>
-        </w:rPr>
-      </w:r>
-      <w:r>
-        <w:rPr>
-          <w:b w:val="0"/>
-          <w:bCs w:val="0"/>
-          <w:highlight w:val="none"/>
-        </w:rPr>
-      </w:r>
-    </w:p>
-    <w:p>
-      <w:pPr>
-        <w:pBdr/>
-        <w:tabs>
-          <w:tab w:val="left" w:leader="none" w:pos="1080"/>
-          <w:tab w:val="left" w:leader="none" w:pos="1395"/>
-        </w:tabs>
-        <w:spacing/>
-        <w:ind/>
-        <w:jc w:val="both"/>
-        <w:rPr/>
-      </w:pPr>
       <w:r>
         <w:rPr>
           <w:b w:val="0"/>
@@ -1514,6 +1497,125 @@
           <w:b w:val="0"/>
           <w:bCs w:val="0"/>
           <w:highlight w:val="none"/>
+        </w:rPr>
+      </w:r>
+    </w:p>
+    <w:p>
+      <w:pPr>
+        <w:pBdr/>
+        <w:tabs>
+          <w:tab w:val="left" w:leader="none" w:pos="1080"/>
+          <w:tab w:val="left" w:leader="none" w:pos="1395"/>
+        </w:tabs>
+        <w:spacing/>
+        <w:ind/>
+        <w:jc w:val="both"/>
+        <w:rPr>
+          <w:b w:val="0"/>
+          <w:bCs w:val="0"/>
+          <w:highlight w:val="none"/>
+          <w:lang w:val="pt-BR"/>
+        </w:rPr>
+      </w:pPr>
+      <w:r>
+        <w:rPr>
+          <w:b/>
+          <w:bCs/>
+          <w:highlight w:val="none"/>
+        </w:rPr>
+      </w:r>
+      <w:r>
+        <w:rPr>
+          <w:b/>
+          <w:bCs/>
+          <w:highlight w:val="none"/>
+        </w:rPr>
+        <w:t xml:space="preserve">Embedding</w:t>
+      </w:r>
+      <w:r>
+        <w:rPr>
+          <w:b/>
+          <w:bCs/>
+          <w:highlight w:val="none"/>
+        </w:rPr>
+        <w:t xml:space="preserve"> </w:t>
+      </w:r>
+      <w:r>
+        <w:rPr>
+          <w:b w:val="0"/>
+          <w:bCs w:val="0"/>
+          <w:highlight w:val="none"/>
+        </w:rPr>
+        <w:t xml:space="preserve">-</w:t>
+      </w:r>
+      <w:r>
+        <w:rPr>
+          <w:b w:val="0"/>
+          <w:bCs w:val="0"/>
+          <w:lang w:val="undefined"/>
+        </w:rPr>
+        <w:t xml:space="preserve"> </w:t>
+      </w:r>
+      <w:r>
+        <w:rPr>
+          <w:b w:val="0"/>
+          <w:bCs w:val="0"/>
+          <w:lang w:val="undefined"/>
+        </w:rPr>
+        <w:t xml:space="preserve">converter dados em um formato vetorial</w:t>
+      </w:r>
+      <w:r>
+        <w:rPr>
+          <w:b w:val="0"/>
+          <w:bCs w:val="0"/>
+          <w:lang w:val="pt-BR"/>
+        </w:rPr>
+        <w:t xml:space="preserve">.</w:t>
+      </w:r>
+      <w:r>
+        <w:rPr>
+          <w:b w:val="0"/>
+          <w:bCs w:val="0"/>
+        </w:rPr>
+      </w:r>
+    </w:p>
+    <w:p>
+      <w:pPr>
+        <w:pBdr/>
+        <w:tabs>
+          <w:tab w:val="left" w:leader="none" w:pos="1080"/>
+          <w:tab w:val="left" w:leader="none" w:pos="1395"/>
+        </w:tabs>
+        <w:spacing/>
+        <w:ind/>
+        <w:jc w:val="both"/>
+        <w:rPr>
+          <w:b w:val="0"/>
+          <w:bCs w:val="0"/>
+        </w:rPr>
+      </w:pPr>
+      <w:r>
+        <w:rPr>
+          <w:b w:val="0"/>
+          <w:bCs w:val="0"/>
+          <w:highlight w:val="none"/>
+          <w:lang w:val="pt-BR"/>
+        </w:rPr>
+      </w:r>
+      <w:r>
+        <w:rPr>
+          <w:b w:val="0"/>
+          <w:bCs w:val="0"/>
+          <w:highlight w:val="none"/>
+          <w:lang w:val="pt-BR"/>
+        </w:rPr>
+      </w:r>
+      <w:r>
+        <w:rPr>
+          <w:b w:val="0"/>
+          <w:bCs w:val="0"/>
+          <w:highlight w:val="none"/>
+          <w:lang w:val="pt-BR"/>
         </w:rPr>
       </w:r>
     </w:p>

</xml_diff>